<commit_message>
Sprint 4 Excel Dashboard and Story Telling
</commit_message>
<xml_diff>
--- a/Preprocessing Log.docx
+++ b/Preprocessing Log.docx
@@ -1,6 +1,6 @@
 
 <file path=word/document.xml><?xml version="1.0" encoding="utf-8"?>
-<w:document xmlns:wpc="http://schemas.microsoft.com/office/word/2010/wordprocessingCanvas" xmlns:cx="http://schemas.microsoft.com/office/drawing/2014/chartex" xmlns:cx1="http://schemas.microsoft.com/office/drawing/2015/9/8/chartex" xmlns:cx2="http://schemas.microsoft.com/office/drawing/2015/10/21/chartex" xmlns:cx3="http://schemas.microsoft.com/office/drawing/2016/5/9/chartex" xmlns:cx4="http://schemas.microsoft.com/office/drawing/2016/5/10/chartex" xmlns:cx5="http://schemas.microsoft.com/office/drawing/2016/5/11/chartex" xmlns:cx6="http://schemas.microsoft.com/office/drawing/2016/5/12/chartex" xmlns:cx7="http://schemas.microsoft.com/office/drawing/2016/5/13/chartex" xmlns:cx8="http://schemas.microsoft.com/office/drawing/2016/5/14/chartex" xmlns:mc="http://schemas.openxmlformats.org/markup-compatibility/2006" xmlns:aink="http://schemas.microsoft.com/office/drawing/2016/ink" xmlns:am3d="http://schemas.microsoft.com/office/drawing/2017/model3d" xmlns:o="urn:schemas-microsoft-com:office:office" xmlns:oel="http://schemas.microsoft.com/office/2019/extlst" xmlns:r="http://schemas.openxmlformats.org/officeDocument/2006/relationships" xmlns:m="http://schemas.openxmlformats.org/officeDocument/2006/math" xmlns:v="urn:schemas-microsoft-com:vml" xmlns:wp14="http://schemas.microsoft.com/office/word/2010/wordprocessingDrawing" xmlns:wp="http://schemas.openxmlformats.org/drawingml/2006/wordprocessingDrawing" xmlns:w10="urn:schemas-microsoft-com:office:word" xmlns:w="http://schemas.openxmlformats.org/wordprocessingml/2006/main" xmlns:w14="http://schemas.microsoft.com/office/word/2010/wordml" xmlns:w15="http://schemas.microsoft.com/office/word/2012/wordml" xmlns:w16cei="http://schemas.microsoft.com/office/word/2026/wordml/cei" xmlns:w16cex="http://schemas.microsoft.com/office/word/2018/wordml/cex" xmlns:w16cid="http://schemas.microsoft.com/office/word/2016/wordml/cid" xmlns:w16="http://schemas.microsoft.com/office/word/2018/wordml" xmlns:w16du="http://schemas.microsoft.com/office/word/2023/wordml/word16du" xmlns:w16sdtdh="http://schemas.microsoft.com/office/word/2020/wordml/sdtdatahash" xmlns:w16sdtfl="http://schemas.microsoft.com/office/word/2024/wordml/sdtformatlock" xmlns:w16se="http://schemas.microsoft.com/office/word/2015/wordml/symex" xmlns:wpg="http://schemas.microsoft.com/office/word/2010/wordprocessingGroup" xmlns:wpi="http://schemas.microsoft.com/office/word/2010/wordprocessingInk" xmlns:wne="http://schemas.microsoft.com/office/word/2006/wordml" xmlns:wps="http://schemas.microsoft.com/office/word/2010/wordprocessingShape" mc:Ignorable="w14 w15 w16se w16cid w16 w16cex w16sdtdh w16sdtfl w16du wp14">
+<w:document xmlns:wpc="http://schemas.microsoft.com/office/word/2010/wordprocessingCanvas" xmlns:cx="http://schemas.microsoft.com/office/drawing/2014/chartex" xmlns:cx1="http://schemas.microsoft.com/office/drawing/2015/9/8/chartex" xmlns:cx2="http://schemas.microsoft.com/office/drawing/2015/10/21/chartex" xmlns:cx3="http://schemas.microsoft.com/office/drawing/2016/5/9/chartex" xmlns:cx4="http://schemas.microsoft.com/office/drawing/2016/5/10/chartex" xmlns:cx5="http://schemas.microsoft.com/office/drawing/2016/5/11/chartex" xmlns:cx6="http://schemas.microsoft.com/office/drawing/2016/5/12/chartex" xmlns:cx7="http://schemas.microsoft.com/office/drawing/2016/5/13/chartex" xmlns:cx8="http://schemas.microsoft.com/office/drawing/2016/5/14/chartex" xmlns:mc="http://schemas.openxmlformats.org/markup-compatibility/2006" xmlns:aink="http://schemas.microsoft.com/office/drawing/2016/ink" xmlns:am3d="http://schemas.microsoft.com/office/drawing/2017/model3d" xmlns:o="urn:schemas-microsoft-com:office:office" xmlns:oel="http://schemas.microsoft.com/office/2019/extlst" xmlns:r="http://schemas.openxmlformats.org/officeDocument/2006/relationships" xmlns:m="http://schemas.openxmlformats.org/officeDocument/2006/math" xmlns:v="urn:schemas-microsoft-com:vml" xmlns:wp14="http://schemas.microsoft.com/office/word/2010/wordprocessingDrawing" xmlns:wp="http://schemas.openxmlformats.org/drawingml/2006/wordprocessingDrawing" xmlns:w10="urn:schemas-microsoft-com:office:word" xmlns:w="http://schemas.openxmlformats.org/wordprocessingml/2006/main" xmlns:w14="http://schemas.microsoft.com/office/word/2010/wordml" xmlns:w15="http://schemas.microsoft.com/office/word/2012/wordml" xmlns:w16cex="http://schemas.microsoft.com/office/word/2018/wordml/cex" xmlns:w16cid="http://schemas.microsoft.com/office/word/2016/wordml/cid" xmlns:w16="http://schemas.microsoft.com/office/word/2018/wordml" xmlns:w16du="http://schemas.microsoft.com/office/word/2023/wordml/word16du" xmlns:w16sdtdh="http://schemas.microsoft.com/office/word/2020/wordml/sdtdatahash" xmlns:w16sdtfl="http://schemas.microsoft.com/office/word/2024/wordml/sdtformatlock" xmlns:w16se="http://schemas.microsoft.com/office/word/2015/wordml/symex" xmlns:wpg="http://schemas.microsoft.com/office/word/2010/wordprocessingGroup" xmlns:wpi="http://schemas.microsoft.com/office/word/2010/wordprocessingInk" xmlns:wne="http://schemas.microsoft.com/office/word/2006/wordml" xmlns:wps="http://schemas.microsoft.com/office/word/2010/wordprocessingShape" mc:Ignorable="w14 w15 w16se w16cid w16 w16cex w16sdtdh w16sdtfl w16du wp14">
   <w:body>
     <w:p>
       <w:pPr>
@@ -91,6 +91,453 @@
         <w:t>After preprocessing, the dataset was reviewed for missing values, inconsistencies, and potential outliers. The cleaned dataset was retained without removing legitimate observations and is ready for the next stage of analysis.</w:t>
       </w:r>
     </w:p>
+    <w:p>
+      <w:pPr>
+        <w:rPr>
+          <w:b/>
+          <w:bCs/>
+        </w:rPr>
+      </w:pPr>
+      <w:r>
+        <w:rPr>
+          <w:b/>
+          <w:bCs/>
+        </w:rPr>
+        <w:t>6</w:t>
+      </w:r>
+      <w:r>
+        <w:rPr>
+          <w:b/>
+          <w:bCs/>
+        </w:rPr>
+        <w:t>.</w:t>
+      </w:r>
+      <w:r>
+        <w:rPr>
+          <w:b/>
+          <w:bCs/>
+        </w:rPr>
+        <w:t>Hypotheses</w:t>
+      </w:r>
+      <w:r>
+        <w:rPr>
+          <w:b/>
+          <w:bCs/>
+        </w:rPr>
+        <w:t xml:space="preserve"> Testing</w:t>
+      </w:r>
+    </w:p>
+    <w:p>
+      <w:r>
+        <w:t>Hypothesis 1 — Subscription Type &amp; Churn</w:t>
+      </w:r>
+    </w:p>
+    <w:p>
+      <w:r>
+        <w:t>Business Question: How does subscription type relate to customer churn and retention?</w:t>
+      </w:r>
+    </w:p>
+    <w:p>
+      <w:r>
+        <w:t>H₀: Subscription type has no relationship with customer churn.</w:t>
+      </w:r>
+    </w:p>
+    <w:p>
+      <w:r>
+        <w:t>H₁: Subscription type has a relationship with customer churn.</w:t>
+      </w:r>
+    </w:p>
+    <w:p>
+      <w:r>
+        <w:lastRenderedPageBreak/>
+        <w:t>Test: Chi-square test of independence.</w:t>
+      </w:r>
+    </w:p>
+    <w:p>
+      <w:r>
+        <w:t>Hypothesis 2 — Engagement &amp; Churn</w:t>
+      </w:r>
+    </w:p>
+    <w:p>
+      <w:r>
+        <w:t>Business Question: How does user engagement differ between customers who churn and those who remain?</w:t>
+      </w:r>
+    </w:p>
+    <w:p>
+      <w:r>
+        <w:t>H₀: Average completion percentage is not associated with churn.</w:t>
+      </w:r>
+    </w:p>
+    <w:p>
+      <w:r>
+        <w:t>H₁: Higher average completion percentage is associated with lower churn.</w:t>
+      </w:r>
+    </w:p>
+    <w:p>
+      <w:r>
+        <w:t>Test: Logistic regression.</w:t>
+      </w:r>
+    </w:p>
+    <w:p/>
+    <w:p>
+      <w:r>
+        <w:t>Hypothesis 3 — Recent Content &amp; Popularity</w:t>
+      </w:r>
+    </w:p>
+    <w:p>
+      <w:r>
+        <w:t>Business Question:</w:t>
+      </w:r>
+    </w:p>
+    <w:p>
+      <w:r>
+        <w:t>Does recent content have higher popularity scores than older content?</w:t>
+      </w:r>
+    </w:p>
+    <w:p>
+      <w:r>
+        <w:t>H₀: There is no significant difference in popularity between recent and non-recent content.</w:t>
+      </w:r>
+    </w:p>
+    <w:p>
+      <w:r>
+        <w:t>H₁: Recent content has significantly higher popularity scores than non-recent content.</w:t>
+      </w:r>
+    </w:p>
+    <w:p>
+      <w:r>
+        <w:t>Statistical Test: Independent two-sample t-test</w:t>
+      </w:r>
+    </w:p>
+    <w:p>
+      <w:r>
+        <w:t>Tail: One-tailed</w:t>
+      </w:r>
+    </w:p>
+    <w:p/>
+    <w:p>
+      <w:pPr>
+        <w:rPr>
+          <w:b/>
+          <w:bCs/>
+        </w:rPr>
+      </w:pPr>
+      <w:r>
+        <w:rPr>
+          <w:b/>
+          <w:bCs/>
+        </w:rPr>
+        <w:t>7.</w:t>
+      </w:r>
+      <w:r>
+        <w:rPr>
+          <w:b/>
+          <w:bCs/>
+        </w:rPr>
+        <w:t>Result of the Hypothesis</w:t>
+      </w:r>
+    </w:p>
+    <w:p>
+      <w:r>
+        <w:t>Hypothesis 1 — Subscription Type &amp; Customer Churn</w:t>
+      </w:r>
+    </w:p>
+    <w:p>
+      <w:r>
+        <w:t>Chi-square statistic: 367.7909</w:t>
+      </w:r>
+    </w:p>
+    <w:p>
+      <w:r>
+        <w:t>p-value: 1.3653 × 10⁻⁸⁰</w:t>
+      </w:r>
+    </w:p>
+    <w:p>
+      <w:r>
+        <w:t>α: 0.05</w:t>
+      </w:r>
+    </w:p>
+    <w:p>
+      <w:r>
+        <w:t>Decision: Reject H₀</w:t>
+      </w:r>
+    </w:p>
+    <w:p>
+      <w:r>
+        <w:t>Result: Subscription type is significantly associated with customer churn.</w:t>
+      </w:r>
+    </w:p>
+    <w:p>
+      <w:r>
+        <w:t>Hypothesis 2 — Engagement &amp; Customer Churn</w:t>
+      </w:r>
+    </w:p>
+    <w:p>
+      <w:r>
+        <w:t>Logistic regression coefficient: 0.0041</w:t>
+      </w:r>
+    </w:p>
+    <w:p>
+      <w:r>
+        <w:t>One-tailed p-value: 0.7481</w:t>
+      </w:r>
+    </w:p>
+    <w:p>
+      <w:r>
+        <w:lastRenderedPageBreak/>
+        <w:t>α: 0.05</w:t>
+      </w:r>
+    </w:p>
+    <w:p>
+      <w:r>
+        <w:t>Decision: Fail to reject H₀</w:t>
+      </w:r>
+    </w:p>
+    <w:p>
+      <w:r>
+        <w:t>Result: There is insufficient evidence that higher engagement (completion percentage) is associated with lower customer churn.</w:t>
+      </w:r>
+    </w:p>
+    <w:p>
+      <w:r>
+        <w:t>Hypothesis 3 — Recent Content &amp; Popularity</w:t>
+      </w:r>
+    </w:p>
+    <w:p>
+      <w:r>
+        <w:t>Recent content mean: 10.8584</w:t>
+      </w:r>
+    </w:p>
+    <w:p>
+      <w:r>
+        <w:t>Older content mean: 4.1165</w:t>
+      </w:r>
+    </w:p>
+    <w:p>
+      <w:r>
+        <w:t>t-statistic: 51.1152</w:t>
+      </w:r>
+    </w:p>
+    <w:p>
+      <w:r>
+        <w:t>One-tailed p-value: 3.576 × 10⁻¹⁵⁰</w:t>
+      </w:r>
+    </w:p>
+    <w:p>
+      <w:r>
+        <w:t>α: 0.05</w:t>
+      </w:r>
+    </w:p>
+    <w:p>
+      <w:r>
+        <w:t>Decision: Reject H₀</w:t>
+      </w:r>
+    </w:p>
+    <w:p>
+      <w:r>
+        <w:t>Result: Recent content has significantly higher popularity scores than older content.</w:t>
+      </w:r>
+    </w:p>
+    <w:p/>
+    <w:p>
+      <w:pPr>
+        <w:rPr>
+          <w:b/>
+          <w:bCs/>
+        </w:rPr>
+      </w:pPr>
+      <w:r>
+        <w:rPr>
+          <w:b/>
+          <w:bCs/>
+        </w:rPr>
+        <w:t>Final Findings</w:t>
+      </w:r>
+    </w:p>
+    <w:p>
+      <w:r>
+        <w:t>1.Subscription Type &amp; Customer Churn: Subscription type is significantly associated with customer churn. We reject H₀.</w:t>
+      </w:r>
+    </w:p>
+    <w:p>
+      <w:r>
+        <w:t>2.Engagement &amp; Customer Churn: There is insufficient evidence that higher engagement (completion percentage) is associated with lower customer churn. We fail to reject H₀.</w:t>
+      </w:r>
+    </w:p>
+    <w:p>
+      <w:r>
+        <w:t>3.Recent Content &amp; Popularity: Recent content has significantly higher popularity scores than older content. We reject H₀.</w:t>
+      </w:r>
+    </w:p>
+    <w:p/>
+    <w:p>
+      <w:r>
+        <w:t>Sprint 4 — Business Questions &amp; Recommended Charts</w:t>
+      </w:r>
+    </w:p>
+    <w:p>
+      <w:r>
+        <w:t>Business Question</w:t>
+      </w:r>
+    </w:p>
+    <w:p>
+      <w:r>
+        <w:t>Recommended Chart</w:t>
+      </w:r>
+    </w:p>
+    <w:p>
+      <w:r>
+        <w:t>1</w:t>
+      </w:r>
+      <w:r>
+        <w:t xml:space="preserve"> </w:t>
+      </w:r>
+      <w:r>
+        <w:t>Which subscription type has the highest customer churn rate?</w:t>
+      </w:r>
+    </w:p>
+    <w:p>
+      <w:r>
+        <w:t>Clustered Column Chart</w:t>
+      </w:r>
+    </w:p>
+    <w:p>
+      <w:r>
+        <w:t>2</w:t>
+      </w:r>
+    </w:p>
+    <w:p>
+      <w:r>
+        <w:lastRenderedPageBreak/>
+        <w:t>How does engagement level affect customer churn?</w:t>
+      </w:r>
+    </w:p>
+    <w:p>
+      <w:r>
+        <w:t>100% Stacked Column Chart</w:t>
+      </w:r>
+    </w:p>
+    <w:p>
+      <w:r>
+        <w:t>3</w:t>
+      </w:r>
+    </w:p>
+    <w:p>
+      <w:r>
+        <w:t>Which age group has the highest average watch duration?</w:t>
+      </w:r>
+    </w:p>
+    <w:p>
+      <w:r>
+        <w:t>Bar Chart</w:t>
+      </w:r>
+    </w:p>
+    <w:p>
+      <w:r>
+        <w:t>4</w:t>
+      </w:r>
+    </w:p>
+    <w:p>
+      <w:r>
+        <w:t>Which device type is used most for viewing content?</w:t>
+      </w:r>
+    </w:p>
+    <w:p>
+      <w:r>
+        <w:t>Donut Chart</w:t>
+      </w:r>
+    </w:p>
+    <w:p>
+      <w:r>
+        <w:t>5</w:t>
+      </w:r>
+    </w:p>
+    <w:p>
+      <w:r>
+        <w:t>Which time of day has the highest viewing activity?</w:t>
+      </w:r>
+    </w:p>
+    <w:p>
+      <w:r>
+        <w:t>Column Chart</w:t>
+      </w:r>
+    </w:p>
+    <w:p>
+      <w:r>
+        <w:t>6</w:t>
+      </w:r>
+    </w:p>
+    <w:p>
+      <w:r>
+        <w:t>Does higher completion percentage correspond to longer watch duration?</w:t>
+      </w:r>
+    </w:p>
+    <w:p>
+      <w:r>
+        <w:t>Scatter Plot</w:t>
+      </w:r>
+    </w:p>
+    <w:p>
+      <w:r>
+        <w:t>7</w:t>
+      </w:r>
+    </w:p>
+    <w:p>
+      <w:r>
+        <w:t>Which region has the highest number of active users?</w:t>
+      </w:r>
+    </w:p>
+    <w:p>
+      <w:r>
+        <w:t>Filled Map or Bar Chart</w:t>
+      </w:r>
+    </w:p>
+    <w:p>
+      <w:r>
+        <w:t>8</w:t>
+      </w:r>
+    </w:p>
+    <w:p>
+      <w:r>
+        <w:t>Which subscription type generates the highest monthly fee revenue?</w:t>
+      </w:r>
+    </w:p>
+    <w:p>
+      <w:r>
+        <w:t>Column Chart</w:t>
+      </w:r>
+    </w:p>
+    <w:p>
+      <w:r>
+        <w:t>9</w:t>
+      </w:r>
+    </w:p>
+    <w:p>
+      <w:r>
+        <w:t>Which content has the highest popularity score?</w:t>
+      </w:r>
+    </w:p>
+    <w:p>
+      <w:r>
+        <w:t>Top 10 Bar Chart</w:t>
+      </w:r>
+    </w:p>
+    <w:p>
+      <w:r>
+        <w:t>10</w:t>
+      </w:r>
+    </w:p>
+    <w:p>
+      <w:r>
+        <w:t>Are recent contents more popular than older contents?</w:t>
+      </w:r>
+    </w:p>
+    <w:p>
+      <w:r>
+        <w:lastRenderedPageBreak/>
+        <w:t>Clustered Column Chart</w:t>
+      </w:r>
+    </w:p>
     <w:sectPr>
       <w:pgSz w:w="12240" w:h="15840"/>
       <w:pgMar w:top="1440" w:right="1800" w:bottom="1440" w:left="1800" w:header="720" w:footer="720" w:gutter="0"/>
@@ -102,7 +549,7 @@
 </file>
 
 <file path=word/numbering.xml><?xml version="1.0" encoding="utf-8"?>
-<w:numbering xmlns:wpc="http://schemas.microsoft.com/office/word/2010/wordprocessingCanvas" xmlns:cx="http://schemas.microsoft.com/office/drawing/2014/chartex" xmlns:cx1="http://schemas.microsoft.com/office/drawing/2015/9/8/chartex" xmlns:cx2="http://schemas.microsoft.com/office/drawing/2015/10/21/chartex" xmlns:cx3="http://schemas.microsoft.com/office/drawing/2016/5/9/chartex" xmlns:cx4="http://schemas.microsoft.com/office/drawing/2016/5/10/chartex" xmlns:cx5="http://schemas.microsoft.com/office/drawing/2016/5/11/chartex" xmlns:cx6="http://schemas.microsoft.com/office/drawing/2016/5/12/chartex" xmlns:cx7="http://schemas.microsoft.com/office/drawing/2016/5/13/chartex" xmlns:cx8="http://schemas.microsoft.com/office/drawing/2016/5/14/chartex" xmlns:mc="http://schemas.openxmlformats.org/markup-compatibility/2006" xmlns:aink="http://schemas.microsoft.com/office/drawing/2016/ink" xmlns:am3d="http://schemas.microsoft.com/office/drawing/2017/model3d" xmlns:o="urn:schemas-microsoft-com:office:office" xmlns:oel="http://schemas.microsoft.com/office/2019/extlst" xmlns:r="http://schemas.openxmlformats.org/officeDocument/2006/relationships" xmlns:m="http://schemas.openxmlformats.org/officeDocument/2006/math" xmlns:v="urn:schemas-microsoft-com:vml" xmlns:wp14="http://schemas.microsoft.com/office/word/2010/wordprocessingDrawing" xmlns:wp="http://schemas.openxmlformats.org/drawingml/2006/wordprocessingDrawing" xmlns:w10="urn:schemas-microsoft-com:office:word" xmlns:w="http://schemas.openxmlformats.org/wordprocessingml/2006/main" xmlns:w14="http://schemas.microsoft.com/office/word/2010/wordml" xmlns:w15="http://schemas.microsoft.com/office/word/2012/wordml" xmlns:w16cei="http://schemas.microsoft.com/office/word/2026/wordml/cei" xmlns:w16cex="http://schemas.microsoft.com/office/word/2018/wordml/cex" xmlns:w16cid="http://schemas.microsoft.com/office/word/2016/wordml/cid" xmlns:w16="http://schemas.microsoft.com/office/word/2018/wordml" xmlns:w16du="http://schemas.microsoft.com/office/word/2023/wordml/word16du" xmlns:w16sdtdh="http://schemas.microsoft.com/office/word/2020/wordml/sdtdatahash" xmlns:w16sdtfl="http://schemas.microsoft.com/office/word/2024/wordml/sdtformatlock" xmlns:w16se="http://schemas.microsoft.com/office/word/2015/wordml/symex" xmlns:wpg="http://schemas.microsoft.com/office/word/2010/wordprocessingGroup" xmlns:wpi="http://schemas.microsoft.com/office/word/2010/wordprocessingInk" xmlns:wne="http://schemas.microsoft.com/office/word/2006/wordml" xmlns:wps="http://schemas.microsoft.com/office/word/2010/wordprocessingShape" mc:Ignorable="w14 w15 w16se w16cid w16 w16cex w16sdtdh w16sdtfl w16du wp14">
+<w:numbering xmlns:wpc="http://schemas.microsoft.com/office/word/2010/wordprocessingCanvas" xmlns:cx="http://schemas.microsoft.com/office/drawing/2014/chartex" xmlns:cx1="http://schemas.microsoft.com/office/drawing/2015/9/8/chartex" xmlns:cx2="http://schemas.microsoft.com/office/drawing/2015/10/21/chartex" xmlns:cx3="http://schemas.microsoft.com/office/drawing/2016/5/9/chartex" xmlns:cx4="http://schemas.microsoft.com/office/drawing/2016/5/10/chartex" xmlns:cx5="http://schemas.microsoft.com/office/drawing/2016/5/11/chartex" xmlns:cx6="http://schemas.microsoft.com/office/drawing/2016/5/12/chartex" xmlns:cx7="http://schemas.microsoft.com/office/drawing/2016/5/13/chartex" xmlns:cx8="http://schemas.microsoft.com/office/drawing/2016/5/14/chartex" xmlns:mc="http://schemas.openxmlformats.org/markup-compatibility/2006" xmlns:aink="http://schemas.microsoft.com/office/drawing/2016/ink" xmlns:am3d="http://schemas.microsoft.com/office/drawing/2017/model3d" xmlns:o="urn:schemas-microsoft-com:office:office" xmlns:oel="http://schemas.microsoft.com/office/2019/extlst" xmlns:r="http://schemas.openxmlformats.org/officeDocument/2006/relationships" xmlns:m="http://schemas.openxmlformats.org/officeDocument/2006/math" xmlns:v="urn:schemas-microsoft-com:vml" xmlns:wp14="http://schemas.microsoft.com/office/word/2010/wordprocessingDrawing" xmlns:wp="http://schemas.openxmlformats.org/drawingml/2006/wordprocessingDrawing" xmlns:w10="urn:schemas-microsoft-com:office:word" xmlns:w="http://schemas.openxmlformats.org/wordprocessingml/2006/main" xmlns:w14="http://schemas.microsoft.com/office/word/2010/wordml" xmlns:w15="http://schemas.microsoft.com/office/word/2012/wordml" xmlns:w16cex="http://schemas.microsoft.com/office/word/2018/wordml/cex" xmlns:w16cid="http://schemas.microsoft.com/office/word/2016/wordml/cid" xmlns:w16="http://schemas.microsoft.com/office/word/2018/wordml" xmlns:w16du="http://schemas.microsoft.com/office/word/2023/wordml/word16du" xmlns:w16sdtdh="http://schemas.microsoft.com/office/word/2020/wordml/sdtdatahash" xmlns:w16sdtfl="http://schemas.microsoft.com/office/word/2024/wordml/sdtformatlock" xmlns:w16se="http://schemas.microsoft.com/office/word/2015/wordml/symex" xmlns:wpg="http://schemas.microsoft.com/office/word/2010/wordprocessingGroup" xmlns:wpi="http://schemas.microsoft.com/office/word/2010/wordprocessingInk" xmlns:wne="http://schemas.microsoft.com/office/word/2006/wordml" xmlns:wps="http://schemas.microsoft.com/office/word/2010/wordprocessingShape" mc:Ignorable="w14 w15 w16se w16cid w16 w16cex w16sdtdh w16sdtfl w16du wp14">
   <w:abstractNum w:abstractNumId="0" w15:restartNumberingAfterBreak="0">
     <w:nsid w:val="FFFFFF7C"/>
     <w:multiLevelType w:val="singleLevel"/>

</xml_diff>